<commit_message>
closses #03 Flowchart Sistem
</commit_message>
<xml_diff>
--- a/System-analisis/FLOWCHART WARUNG FINA BERRY.docx
+++ b/System-analisis/FLOWCHART WARUNG FINA BERRY.docx
@@ -13,23 +13,34 @@
       </w:pPr>
       <w:r>
         <w:rPr>
+          <w:rFonts w:ascii="Times New Roman" w:hAnsi="Times New Roman" w:cs="Times New Roman"/>
+          <w:b/>
+          <w:bCs/>
+        </w:rPr>
+        <w:t>FLOWCHART WARUNG FINA BERRY</w:t>
+      </w:r>
+    </w:p>
+    <w:p>
+      <w:pPr>
+        <w:jc w:val="center"/>
+        <w:rPr>
+          <w:rFonts w:ascii="Times New Roman" w:hAnsi="Times New Roman" w:cs="Times New Roman"/>
+          <w:b/>
+          <w:bCs/>
+        </w:rPr>
+      </w:pPr>
+      <w:r>
+        <w:rPr>
+          <w:rFonts w:ascii="Times New Roman" w:hAnsi="Times New Roman" w:cs="Times New Roman"/>
           <w:b/>
           <w:bCs/>
           <w:noProof/>
         </w:rPr>
         <w:drawing>
-          <wp:anchor distT="0" distB="0" distL="114300" distR="114300" simplePos="0" relativeHeight="251658240" behindDoc="0" locked="0" layoutInCell="1" allowOverlap="1" wp14:anchorId="6D78DD59" wp14:editId="403FCEC6">
-            <wp:simplePos x="0" y="0"/>
-            <wp:positionH relativeFrom="column">
-              <wp:posOffset>771525</wp:posOffset>
-            </wp:positionH>
-            <wp:positionV relativeFrom="paragraph">
-              <wp:posOffset>542925</wp:posOffset>
-            </wp:positionV>
-            <wp:extent cx="4572000" cy="6724650"/>
-            <wp:effectExtent l="0" t="0" r="0" b="0"/>
-            <wp:wrapSquare wrapText="bothSides"/>
-            <wp:docPr id="1" name="Picture 1"/>
+          <wp:inline distT="0" distB="0" distL="0" distR="0" wp14:anchorId="183825BB" wp14:editId="55CE78EE">
+            <wp:extent cx="3742661" cy="6548684"/>
+            <wp:effectExtent l="0" t="0" r="0" b="5080"/>
+            <wp:docPr id="752033550" name="Picture 1"/>
             <wp:cNvGraphicFramePr>
               <a:graphicFrameLocks xmlns:a="http://schemas.openxmlformats.org/drawingml/2006/main" noChangeAspect="1"/>
             </wp:cNvGraphicFramePr>
@@ -37,10 +48,8 @@
               <a:graphicData uri="http://schemas.openxmlformats.org/drawingml/2006/picture">
                 <pic:pic xmlns:pic="http://schemas.openxmlformats.org/drawingml/2006/picture">
                   <pic:nvPicPr>
-                    <pic:cNvPr id="0" name=""/>
-                    <pic:cNvPicPr>
-                      <a:picLocks noChangeAspect="1" noChangeArrowheads="1"/>
-                    </pic:cNvPicPr>
+                    <pic:cNvPr id="752033550" name="Picture 752033550"/>
+                    <pic:cNvPicPr/>
                   </pic:nvPicPr>
                   <pic:blipFill>
                     <a:blip r:embed="rId4">
@@ -50,15 +59,14 @@
                         </a:ext>
                       </a:extLst>
                     </a:blip>
-                    <a:srcRect/>
                     <a:stretch>
                       <a:fillRect/>
                     </a:stretch>
                   </pic:blipFill>
-                  <pic:spPr bwMode="auto">
+                  <pic:spPr>
                     <a:xfrm>
                       <a:off x="0" y="0"/>
-                      <a:ext cx="4572000" cy="6724650"/>
+                      <a:ext cx="3758716" cy="6576775"/>
                     </a:xfrm>
                     <a:prstGeom prst="rect">
                       <a:avLst/>
@@ -67,16 +75,8 @@
                 </pic:pic>
               </a:graphicData>
             </a:graphic>
-          </wp:anchor>
+          </wp:inline>
         </w:drawing>
-      </w:r>
-      <w:r>
-        <w:rPr>
-          <w:rFonts w:ascii="Times New Roman" w:hAnsi="Times New Roman" w:cs="Times New Roman"/>
-          <w:b/>
-          <w:bCs/>
-        </w:rPr>
-        <w:t>FLOWCHART WARUNG FINA BERRY</w:t>
       </w:r>
       <w:r>
         <w:rPr>
@@ -96,14 +96,15 @@
       </w:pPr>
       <w:r>
         <w:rPr>
+          <w:rFonts w:ascii="Times New Roman" w:hAnsi="Times New Roman" w:cs="Times New Roman"/>
           <w:noProof/>
         </w:rPr>
         <w:lastRenderedPageBreak/>
         <w:drawing>
-          <wp:inline distT="0" distB="0" distL="0" distR="0" wp14:anchorId="53945AA1" wp14:editId="7D65B9D0">
-            <wp:extent cx="4572000" cy="5600700"/>
+          <wp:inline distT="0" distB="0" distL="0" distR="0" wp14:anchorId="19EFF3D9" wp14:editId="3EF4D6ED">
+            <wp:extent cx="4192550" cy="7453423"/>
             <wp:effectExtent l="0" t="0" r="0" b="0"/>
-            <wp:docPr id="661120771" name="Picture 661120771"/>
+            <wp:docPr id="1902592293" name="Picture 2"/>
             <wp:cNvGraphicFramePr>
               <a:graphicFrameLocks xmlns:a="http://schemas.openxmlformats.org/drawingml/2006/main" noChangeAspect="1"/>
             </wp:cNvGraphicFramePr>
@@ -111,22 +112,97 @@
               <a:graphicData uri="http://schemas.openxmlformats.org/drawingml/2006/picture">
                 <pic:pic xmlns:pic="http://schemas.openxmlformats.org/drawingml/2006/picture">
                   <pic:nvPicPr>
-                    <pic:cNvPr id="1" name="Picture 1"/>
-                    <pic:cNvPicPr>
-                      <a:picLocks noChangeAspect="1"/>
-                    </pic:cNvPicPr>
+                    <pic:cNvPr id="1902592293" name="Picture 1902592293"/>
+                    <pic:cNvPicPr/>
                   </pic:nvPicPr>
                   <pic:blipFill>
-                    <a:blip r:embed="rId5"/>
-                    <a:srcRect/>
+                    <a:blip r:embed="rId5">
+                      <a:extLst>
+                        <a:ext uri="{28A0092B-C50C-407E-A947-70E740481C1C}">
+                          <a14:useLocalDpi xmlns:a14="http://schemas.microsoft.com/office/drawing/2010/main" val="0"/>
+                        </a:ext>
+                      </a:extLst>
+                    </a:blip>
                     <a:stretch>
                       <a:fillRect/>
                     </a:stretch>
                   </pic:blipFill>
-                  <pic:spPr bwMode="auto">
+                  <pic:spPr>
                     <a:xfrm>
                       <a:off x="0" y="0"/>
-                      <a:ext cx="4572000" cy="5600700"/>
+                      <a:ext cx="4202074" cy="7470354"/>
+                    </a:xfrm>
+                    <a:prstGeom prst="rect">
+                      <a:avLst/>
+                    </a:prstGeom>
+                  </pic:spPr>
+                </pic:pic>
+              </a:graphicData>
+            </a:graphic>
+          </wp:inline>
+        </w:drawing>
+      </w:r>
+    </w:p>
+    <w:p>
+      <w:pPr>
+        <w:jc w:val="center"/>
+        <w:rPr>
+          <w:rFonts w:ascii="Times New Roman" w:hAnsi="Times New Roman" w:cs="Times New Roman"/>
+        </w:rPr>
+      </w:pPr>
+    </w:p>
+    <w:p>
+      <w:pPr>
+        <w:jc w:val="center"/>
+        <w:rPr>
+          <w:rFonts w:ascii="Times New Roman" w:hAnsi="Times New Roman" w:cs="Times New Roman"/>
+        </w:rPr>
+      </w:pPr>
+    </w:p>
+    <w:p>
+      <w:pPr>
+        <w:jc w:val="center"/>
+        <w:rPr>
+          <w:rFonts w:ascii="Times New Roman" w:hAnsi="Times New Roman" w:cs="Times New Roman"/>
+        </w:rPr>
+      </w:pPr>
+      <w:r>
+        <w:rPr>
+          <w:rFonts w:ascii="Times New Roman" w:hAnsi="Times New Roman" w:cs="Times New Roman"/>
+          <w:noProof/>
+        </w:rPr>
+        <w:lastRenderedPageBreak/>
+        <w:drawing>
+          <wp:inline distT="0" distB="0" distL="0" distR="0" wp14:anchorId="32ECF3A4" wp14:editId="714BD5AB">
+            <wp:extent cx="4138723" cy="7357730"/>
+            <wp:effectExtent l="0" t="0" r="0" b="0"/>
+            <wp:docPr id="206781157" name="Picture 3"/>
+            <wp:cNvGraphicFramePr>
+              <a:graphicFrameLocks xmlns:a="http://schemas.openxmlformats.org/drawingml/2006/main" noChangeAspect="1"/>
+            </wp:cNvGraphicFramePr>
+            <a:graphic xmlns:a="http://schemas.openxmlformats.org/drawingml/2006/main">
+              <a:graphicData uri="http://schemas.openxmlformats.org/drawingml/2006/picture">
+                <pic:pic xmlns:pic="http://schemas.openxmlformats.org/drawingml/2006/picture">
+                  <pic:nvPicPr>
+                    <pic:cNvPr id="206781157" name="Picture 206781157"/>
+                    <pic:cNvPicPr/>
+                  </pic:nvPicPr>
+                  <pic:blipFill>
+                    <a:blip r:embed="rId6">
+                      <a:extLst>
+                        <a:ext uri="{28A0092B-C50C-407E-A947-70E740481C1C}">
+                          <a14:useLocalDpi xmlns:a14="http://schemas.microsoft.com/office/drawing/2010/main" val="0"/>
+                        </a:ext>
+                      </a:extLst>
+                    </a:blip>
+                    <a:stretch>
+                      <a:fillRect/>
+                    </a:stretch>
+                  </pic:blipFill>
+                  <pic:spPr>
+                    <a:xfrm>
+                      <a:off x="0" y="0"/>
+                      <a:ext cx="4149926" cy="7377647"/>
                     </a:xfrm>
                     <a:prstGeom prst="rect">
                       <a:avLst/>
@@ -752,6 +828,7 @@
   <w:style w:type="character" w:default="1" w:styleId="DefaultParagraphFont">
     <w:name w:val="Default Paragraph Font"/>
     <w:uiPriority w:val="1"/>
+    <w:semiHidden/>
     <w:unhideWhenUsed/>
   </w:style>
   <w:style w:type="table" w:default="1" w:styleId="TableNormal">

</xml_diff>